<commit_message>
feat: enhance project configuration and structure; add Sentry integration, update linting scripts, and improve Redis service
</commit_message>
<xml_diff>
--- a/docs/03_sprint_plan.docx
+++ b/docs/03_sprint_plan.docx
@@ -38,13 +38,7 @@
         <w:jc w:val="center"/>
       </w:pPr>
       <w:r>
-        <w:rPr>
-          <w:rFonts w:ascii="Calibri" w:cs="Calibri" w:eastAsia="Calibri" w:hAnsi="Calibri"/>
-          <w:color w:val="059669"/>
-          <w:sz w:val="28"/>
-          <w:szCs w:val="28"/>
-        </w:rPr>
-        <w:t xml:space="preserve">Agile Sprint Plan — 5 Sprints × 2 Weeks</w:t>
+        <w:t>Agile Sprint Plan — 6 Sprints × 2 Weeks</w:t>
       </w:r>
     </w:p>
     <w:p>
@@ -53,12 +47,7 @@
         <w:jc w:val="center"/>
       </w:pPr>
       <w:r>
-        <w:rPr>
-          <w:color w:val="9CA3AF"/>
-          <w:sz w:val="20"/>
-          <w:szCs w:val="20"/>
-        </w:rPr>
-        <w:t xml:space="preserve">Incremental release strategy: Foundation → Core Game → Polish → Social → Scale</w:t>
+        <w:t>Incremental release strategy: Foundation → Core Game → Polish → Social → Quality → Admin</w:t>
       </w:r>
     </w:p>
     <w:p>
@@ -96,12 +85,7 @@
         <w:spacing w:after="120" w:before="80"/>
       </w:pPr>
       <w:r>
-        <w:rPr>
-          <w:color w:val="374151"/>
-          <w:sz w:val="22"/>
-          <w:szCs w:val="22"/>
-        </w:rPr>
-        <w:t xml:space="preserve">This plan organizes development into 5 two-week sprints. Each sprint delivers a working, deployable increment. AI agents must complete each sprint's acceptance criteria before advancing. Backend and frontend work happens in parallel within each sprint using the shared TypeScript contracts defined in packages/shared-types.</w:t>
+        <w:t>This plan organizes development into 6 two-week sprints. Each sprint delivers a working, deployable increment. AI agents must complete each sprint's acceptance criteria before advancing. Backend and frontend work happens in parallel within each sprint using the shared TypeScript contracts defined in packages/shared-types.</w:t>
       </w:r>
     </w:p>
     <w:p>
@@ -844,14 +828,7 @@
           </w:tcPr>
           <w:p>
             <w:r>
-              <w:rPr>
-                <w:b w:val="false"/>
-                <w:bCs w:val="false"/>
-                <w:color w:val="374151"/>
-                <w:sz w:val="20"/>
-                <w:szCs w:val="20"/>
-              </w:rPr>
-              <w:t xml:space="preserve">Scale &amp; Quality</w:t>
+              <w:t>Railway Production Quality</w:t>
             </w:r>
           </w:p>
         </w:tc>
@@ -904,14 +881,49 @@
           </w:tcPr>
           <w:p>
             <w:r>
-              <w:rPr>
-                <w:b w:val="false"/>
-                <w:bCs w:val="false"/>
-                <w:color w:val="374151"/>
-                <w:sz w:val="20"/>
-                <w:szCs w:val="20"/>
-              </w:rPr>
-              <w:t xml:space="preserve">Performance, monitoring, admin panel, more designs</w:t>
+              <w:t>Railway health, Sentry, CI quality gates, admin API, more content</w:t>
+            </w:r>
+          </w:p>
+        </w:tc>
+      </w:tr>
+      <w:tr>
+        <w:tc>
+          <w:tcPr>
+            <w:tcW w:type="dxa" w:w="1200"/>
+          </w:tcPr>
+          <w:p>
+            <w:r>
+              <w:t>6</w:t>
+            </w:r>
+          </w:p>
+        </w:tc>
+        <w:tc>
+          <w:tcPr>
+            <w:tcW w:type="dxa" w:w="2520"/>
+          </w:tcPr>
+          <w:p>
+            <w:r>
+              <w:t>Admin Studio &amp; Governance</w:t>
+            </w:r>
+          </w:p>
+        </w:tc>
+        <w:tc>
+          <w:tcPr>
+            <w:tcW w:type="dxa" w:w="2400"/>
+          </w:tcPr>
+          <w:p>
+            <w:r>
+              <w:t>Weeks 11–12</w:t>
+            </w:r>
+          </w:p>
+        </w:tc>
+        <w:tc>
+          <w:tcPr>
+            <w:tcW w:type="dxa" w:w="3600"/>
+          </w:tcPr>
+          <w:p>
+            <w:r>
+              <w:t>Complete admin dashboard, RBAC, problem builder, publishing controls, and soft delete</w:t>
             </w:r>
           </w:p>
         </w:tc>
@@ -2292,12 +2304,7 @@
         <w:spacing w:after="60" w:before="60"/>
       </w:pPr>
       <w:r>
-        <w:rPr>
-          <w:color w:val="374151"/>
-          <w:sz w:val="22"/>
-          <w:szCs w:val="22"/>
-        </w:rPr>
-        <w:t xml:space="preserve">GET /components: list all component types with icon S3 keys + descriptions</w:t>
+        <w:t>GET /components: list all component types with icon URLs, descriptions, and categories</w:t>
       </w:r>
     </w:p>
     <w:p>
@@ -2328,12 +2335,7 @@
         <w:spacing w:after="60" w:before="60"/>
       </w:pPr>
       <w:r>
-        <w:rPr>
-          <w:color w:val="374151"/>
-          <w:sz w:val="22"/>
-          <w:szCs w:val="22"/>
-        </w:rPr>
-        <w:t xml:space="preserve">Set up S3 bucket for component icons; upload all SVG icon assets</w:t>
+        <w:t>Use public web assets or icon-library mappings for component icons; no external storage service required in Railway phase</w:t>
       </w:r>
     </w:p>
     <w:p>
@@ -5452,15 +5454,7 @@
         <w:spacing w:after="60" w:before="400"/>
       </w:pPr>
       <w:r>
-        <w:rPr>
-          <w:rFonts w:ascii="Calibri" w:cs="Calibri" w:eastAsia="Calibri" w:hAnsi="Calibri"/>
-          <w:b/>
-          <w:bCs/>
-          <w:color w:val="FFFFFF"/>
-          <w:sz w:val="32"/>
-          <w:szCs w:val="32"/>
-        </w:rPr>
-        <w:t xml:space="preserve">  Sprint 5: Scale &amp; Quality</w:t>
+        <w:t xml:space="preserve">  Sprint 5: Railway Production Quality</w:t>
       </w:r>
     </w:p>
     <w:p>
@@ -5469,13 +5463,7 @@
         <w:spacing w:after="200" w:before="0"/>
       </w:pPr>
       <w:r>
-        <w:rPr>
-          <w:rFonts w:ascii="Calibri" w:cs="Calibri" w:eastAsia="Calibri" w:hAnsi="Calibri"/>
-          <w:color w:val="A7F3D0"/>
-          <w:sz w:val="20"/>
-          <w:szCs w:val="20"/>
-        </w:rPr>
-        <w:t xml:space="preserve">  ⏱ 2 weeks   🎯 Goal: Production-ready: monitoring, performance, admin, more content</w:t>
+        <w:t xml:space="preserve">  ⏱ 2 weeks   🎯 Goal: Production-ready on Railway: health, observability, CI quality gates, admin API, and more content</w:t>
       </w:r>
     </w:p>
     <w:p>
@@ -5508,12 +5496,7 @@
         <w:spacing w:after="60" w:before="60"/>
       </w:pPr>
       <w:r>
-        <w:rPr>
-          <w:color w:val="374151"/>
-          <w:sz w:val="22"/>
-          <w:szCs w:val="22"/>
-        </w:rPr>
-        <w:t xml:space="preserve">Add Prometheus metrics endpoint; configure CloudWatch alarms for p95 latency and error rate</w:t>
+        <w:t>Add real production health checks for PostgreSQL and Redis; Railway health checks must reflect actual dependency status</w:t>
       </w:r>
     </w:p>
     <w:p>
@@ -5526,12 +5509,7 @@
         <w:spacing w:after="60" w:before="60"/>
       </w:pPr>
       <w:r>
-        <w:rPr>
-          <w:color w:val="374151"/>
-          <w:sz w:val="22"/>
-          <w:szCs w:val="22"/>
-        </w:rPr>
-        <w:t xml:space="preserve">API integration tests: Supertest E2E tests for full game loop (auth → load problem → submit → score)</w:t>
+        <w:t>API integration tests: Supertest E2E for auth → load problem → requirement graph → submit → score, plus leaderboard, share, and admin access</w:t>
       </w:r>
     </w:p>
     <w:p>
@@ -5544,12 +5522,7 @@
         <w:spacing w:after="60" w:before="60"/>
       </w:pPr>
       <w:r>
-        <w:rPr>
-          <w:color w:val="374151"/>
-          <w:sz w:val="22"/>
-          <w:szCs w:val="22"/>
-        </w:rPr>
-        <w:t xml:space="preserve">Admin module (internal): CRUD for problems + problem graphs (simple REST; no public UI needed in v1)</w:t>
+        <w:t>Admin module (internal): REST CRUD for problems and requirements; protect with JWT plus ADMIN_EMAILS allowlist; no public UI in v1</w:t>
       </w:r>
     </w:p>
     <w:p>
@@ -5562,12 +5535,7 @@
         <w:spacing w:after="60" w:before="60"/>
       </w:pPr>
       <w:r>
-        <w:rPr>
-          <w:color w:val="374151"/>
-          <w:sz w:val="22"/>
-          <w:szCs w:val="22"/>
-        </w:rPr>
-        <w:t xml:space="preserve">Add 5 more problem graphs: Uber, Twitter/X, Netflix, Airbnb, Discord (content sprint)</w:t>
+        <w:t>Add 5 more requirement-based problems: Uber, Twitter/X, Netflix, Airbnb, Discord (content sprint)</w:t>
       </w:r>
     </w:p>
     <w:p>
@@ -5580,12 +5548,7 @@
         <w:spacing w:after="60" w:before="60"/>
       </w:pPr>
       <w:r>
-        <w:rPr>
-          <w:color w:val="374151"/>
-          <w:sz w:val="22"/>
-          <w:szCs w:val="22"/>
-        </w:rPr>
-        <w:t xml:space="preserve">Database connection pooling: configure PgBouncer on RDS or use Prisma connection limit settings</w:t>
+        <w:t>Railway-safe database pooling: configure pg.Pool max connections via DATABASE_POOL_MAX and keep prisma migrate deploy in Railway predeploy</w:t>
       </w:r>
     </w:p>
     <w:p>
@@ -5598,12 +5561,7 @@
         <w:spacing w:after="60" w:before="60"/>
       </w:pPr>
       <w:r>
-        <w:rPr>
-          <w:color w:val="374151"/>
-          <w:sz w:val="22"/>
-          <w:szCs w:val="22"/>
-        </w:rPr>
-        <w:t xml:space="preserve">Implement graceful shutdown: NestJS enableShutdownHooks() for ECS SIGTERM handling</w:t>
+        <w:t>Implement graceful shutdown with NestJS enableShutdownHooks() for Railway restarts and deploy rollovers</w:t>
       </w:r>
     </w:p>
     <w:p>
@@ -5649,12 +5607,7 @@
         <w:spacing w:after="60" w:before="60"/>
       </w:pPr>
       <w:r>
-        <w:rPr>
-          <w:color w:val="374151"/>
-          <w:sz w:val="22"/>
-          <w:szCs w:val="22"/>
-        </w:rPr>
-        <w:t xml:space="preserve">Lighthouse CI: configure GitHub Actions to run Lighthouse on each PR; fail if Performance &lt; 80</w:t>
+        <w:t>Lighthouse CI: configure GitHub Actions to run local production Lighthouse on each PR; fail if Performance &lt; 80 or Accessibility &lt; 85</w:t>
       </w:r>
     </w:p>
     <w:p>
@@ -5667,12 +5620,7 @@
         <w:spacing w:after="60" w:before="60"/>
       </w:pPr>
       <w:r>
-        <w:rPr>
-          <w:color w:val="374151"/>
-          <w:sz w:val="22"/>
-          <w:szCs w:val="22"/>
-        </w:rPr>
-        <w:t xml:space="preserve">Error boundaries: add React error boundaries to game canvas and result overlay</w:t>
+        <w:t>Error boundaries: add app-level and game/result fallbacks with reset navigation and user-friendly recovery</w:t>
       </w:r>
     </w:p>
     <w:p>
@@ -5685,12 +5633,7 @@
         <w:spacing w:after="60" w:before="60"/>
       </w:pPr>
       <w:r>
-        <w:rPr>
-          <w:color w:val="374151"/>
-          <w:sz w:val="22"/>
-          <w:szCs w:val="22"/>
-        </w:rPr>
-        <w:t xml:space="preserve">Sentry integration: configure @sentry/nextjs for client-side error tracking</w:t>
+        <w:t>Sentry integration: configure Next.js and NestJS error tracking with environment and release tags</w:t>
       </w:r>
     </w:p>
     <w:p>
@@ -5703,12 +5646,7 @@
         <w:spacing w:after="60" w:before="60"/>
       </w:pPr>
       <w:r>
-        <w:rPr>
-          <w:color w:val="374151"/>
-          <w:sz w:val="22"/>
-          <w:szCs w:val="22"/>
-        </w:rPr>
-        <w:t xml:space="preserve">Bundle analysis: run @next/bundle-analyzer; identify and eliminate any chunk &gt; 100KB</w:t>
+        <w:t>Bundle analysis: configure @next/bundle-analyzer; identify and reduce any application chunk &gt; 100KB where feasible</w:t>
       </w:r>
     </w:p>
     <w:p>
@@ -5721,12 +5659,7 @@
         <w:spacing w:after="60" w:before="60"/>
       </w:pPr>
       <w:r>
-        <w:rPr>
-          <w:color w:val="374151"/>
-          <w:sz w:val="22"/>
-          <w:szCs w:val="22"/>
-        </w:rPr>
-        <w:t xml:space="preserve">E2E tests: Playwright test suite for critical paths (landing → login → play game → see result)</w:t>
+        <w:t>E2E tests: Playwright critical paths for landing → login → play one requirement → result, share-link redirect, and mobile read-only behavior</w:t>
       </w:r>
     </w:p>
     <w:p>
@@ -5739,12 +5672,7 @@
         <w:spacing w:after="60" w:before="60"/>
       </w:pPr>
       <w:r>
-        <w:rPr>
-          <w:color w:val="374151"/>
-          <w:sz w:val="22"/>
-          <w:szCs w:val="22"/>
-        </w:rPr>
-        <w:t xml:space="preserve">Mobile read-only view: polished "Play on desktop" banner with canvas preview for mobile users</w:t>
+        <w:t>Mobile read-only view: polished "Play on tablet or desktop" banner with canvas preview for screens below 768px</w:t>
       </w:r>
     </w:p>
     <w:p>
@@ -5757,12 +5685,7 @@
         <w:spacing w:after="60" w:before="60"/>
       </w:pPr>
       <w:r>
-        <w:rPr>
-          <w:color w:val="374151"/>
-          <w:sz w:val="22"/>
-          <w:szCs w:val="22"/>
-        </w:rPr>
-        <w:t xml:space="preserve">SEO: meta tags, Open Graph images for each problem page (og:image via @vercel/og or custom API)</w:t>
+        <w:t>SEO: metadata and Open Graph tags for each problem page with a static default OG image fallback</w:t>
       </w:r>
     </w:p>
     <w:p>
@@ -5838,14 +5761,7 @@
           </w:tcPr>
           <w:p>
             <w:r>
-              <w:rPr>
-                <w:b/>
-                <w:bCs/>
-                <w:color w:val="FFFFFF"/>
-                <w:sz w:val="20"/>
-                <w:szCs w:val="20"/>
-              </w:rPr>
-              <w:t xml:space="preserve">Criterion</w:t>
+              <w:t>Criterion</w:t>
             </w:r>
           </w:p>
         </w:tc>
@@ -5868,14 +5784,7 @@
           </w:tcPr>
           <w:p>
             <w:r>
-              <w:rPr>
-                <w:b/>
-                <w:bCs/>
-                <w:color w:val="FFFFFF"/>
-                <w:sz w:val="20"/>
-                <w:szCs w:val="20"/>
-              </w:rPr>
-              <w:t xml:space="preserve">Backend</w:t>
+              <w:t>Backend</w:t>
             </w:r>
           </w:p>
         </w:tc>
@@ -5898,14 +5807,7 @@
           </w:tcPr>
           <w:p>
             <w:r>
-              <w:rPr>
-                <w:b/>
-                <w:bCs/>
-                <w:color w:val="FFFFFF"/>
-                <w:sz w:val="20"/>
-                <w:szCs w:val="20"/>
-              </w:rPr>
-              <w:t xml:space="preserve">Frontend</w:t>
+              <w:t>Frontend</w:t>
             </w:r>
           </w:p>
         </w:tc>
@@ -5933,74 +5835,53 @@
           </w:tcPr>
           <w:p>
             <w:r>
-              <w:rPr>
-                <w:b w:val="false"/>
-                <w:bCs w:val="false"/>
-                <w:color w:val="374151"/>
-                <w:sz w:val="20"/>
-                <w:szCs w:val="20"/>
-              </w:rPr>
-              <w:t xml:space="preserve">10+ problems fully playable in production</w:t>
-            </w:r>
-          </w:p>
-        </w:tc>
-        <w:tc>
-          <w:tcPr>
-            <w:tcW w:type="dxa" w:w="1200"/>
-            <w:tcBorders>
-              <w:top w:val="single" w:color="CCCCCC" w:sz="1"/>
-              <w:left w:val="single" w:color="CCCCCC" w:sz="1"/>
-              <w:bottom w:val="single" w:color="CCCCCC" w:sz="1"/>
-              <w:right w:val="single" w:color="CCCCCC" w:sz="1"/>
-            </w:tcBorders>
-            <w:shd w:fill="FAFAFA" w:val="clear"/>
-            <w:tcMar>
-              <w:top w:type="dxa" w:w="100"/>
-              <w:left w:type="dxa" w:w="140"/>
-              <w:bottom w:type="dxa" w:w="100"/>
-              <w:right w:type="dxa" w:w="140"/>
-            </w:tcMar>
-          </w:tcPr>
-          <w:p>
-            <w:r>
-              <w:rPr>
-                <w:b w:val="false"/>
-                <w:bCs w:val="false"/>
-                <w:color w:val="374151"/>
-                <w:sz w:val="20"/>
-                <w:szCs w:val="20"/>
-              </w:rPr>
-              <w:t xml:space="preserve">✅</w:t>
-            </w:r>
-          </w:p>
-        </w:tc>
-        <w:tc>
-          <w:tcPr>
-            <w:tcW w:type="dxa" w:w="1200"/>
-            <w:tcBorders>
-              <w:top w:val="single" w:color="CCCCCC" w:sz="1"/>
-              <w:left w:val="single" w:color="CCCCCC" w:sz="1"/>
-              <w:bottom w:val="single" w:color="CCCCCC" w:sz="1"/>
-              <w:right w:val="single" w:color="CCCCCC" w:sz="1"/>
-            </w:tcBorders>
-            <w:shd w:fill="FAFAFA" w:val="clear"/>
-            <w:tcMar>
-              <w:top w:type="dxa" w:w="100"/>
-              <w:left w:type="dxa" w:w="140"/>
-              <w:bottom w:type="dxa" w:w="100"/>
-              <w:right w:type="dxa" w:w="140"/>
-            </w:tcMar>
-          </w:tcPr>
-          <w:p>
-            <w:r>
-              <w:rPr>
-                <w:b w:val="false"/>
-                <w:bCs w:val="false"/>
-                <w:color w:val="374151"/>
-                <w:sz w:val="20"/>
-                <w:szCs w:val="20"/>
-              </w:rPr>
-              <w:t xml:space="preserve">✅</w:t>
+              <w:t>10+ published problems fully playable on Railway</w:t>
+            </w:r>
+          </w:p>
+        </w:tc>
+        <w:tc>
+          <w:tcPr>
+            <w:tcW w:type="dxa" w:w="1200"/>
+            <w:tcBorders>
+              <w:top w:val="single" w:color="CCCCCC" w:sz="1"/>
+              <w:left w:val="single" w:color="CCCCCC" w:sz="1"/>
+              <w:bottom w:val="single" w:color="CCCCCC" w:sz="1"/>
+              <w:right w:val="single" w:color="CCCCCC" w:sz="1"/>
+            </w:tcBorders>
+            <w:shd w:fill="FAFAFA" w:val="clear"/>
+            <w:tcMar>
+              <w:top w:type="dxa" w:w="100"/>
+              <w:left w:type="dxa" w:w="140"/>
+              <w:bottom w:type="dxa" w:w="100"/>
+              <w:right w:type="dxa" w:w="140"/>
+            </w:tcMar>
+          </w:tcPr>
+          <w:p>
+            <w:r>
+              <w:t>✅</w:t>
+            </w:r>
+          </w:p>
+        </w:tc>
+        <w:tc>
+          <w:tcPr>
+            <w:tcW w:type="dxa" w:w="1200"/>
+            <w:tcBorders>
+              <w:top w:val="single" w:color="CCCCCC" w:sz="1"/>
+              <w:left w:val="single" w:color="CCCCCC" w:sz="1"/>
+              <w:bottom w:val="single" w:color="CCCCCC" w:sz="1"/>
+              <w:right w:val="single" w:color="CCCCCC" w:sz="1"/>
+            </w:tcBorders>
+            <w:shd w:fill="FAFAFA" w:val="clear"/>
+            <w:tcMar>
+              <w:top w:type="dxa" w:w="100"/>
+              <w:left w:type="dxa" w:w="140"/>
+              <w:bottom w:type="dxa" w:w="100"/>
+              <w:right w:type="dxa" w:w="140"/>
+            </w:tcMar>
+          </w:tcPr>
+          <w:p>
+            <w:r>
+              <w:t>✅</w:t>
             </w:r>
           </w:p>
         </w:tc>
@@ -6028,74 +5909,53 @@
           </w:tcPr>
           <w:p>
             <w:r>
-              <w:rPr>
-                <w:b w:val="false"/>
-                <w:bCs w:val="false"/>
-                <w:color w:val="374151"/>
-                <w:sz w:val="20"/>
-                <w:szCs w:val="20"/>
-              </w:rPr>
-              <w:t xml:space="preserve">Playwright E2E tests pass on CI</w:t>
-            </w:r>
-          </w:p>
-        </w:tc>
-        <w:tc>
-          <w:tcPr>
-            <w:tcW w:type="dxa" w:w="1200"/>
-            <w:tcBorders>
-              <w:top w:val="single" w:color="CCCCCC" w:sz="1"/>
-              <w:left w:val="single" w:color="CCCCCC" w:sz="1"/>
-              <w:bottom w:val="single" w:color="CCCCCC" w:sz="1"/>
-              <w:right w:val="single" w:color="CCCCCC" w:sz="1"/>
-            </w:tcBorders>
-            <w:shd w:fill="FAFAFA" w:val="clear"/>
-            <w:tcMar>
-              <w:top w:type="dxa" w:w="100"/>
-              <w:left w:type="dxa" w:w="140"/>
-              <w:bottom w:type="dxa" w:w="100"/>
-              <w:right w:type="dxa" w:w="140"/>
-            </w:tcMar>
-          </w:tcPr>
-          <w:p>
-            <w:r>
-              <w:rPr>
-                <w:b w:val="false"/>
-                <w:bCs w:val="false"/>
-                <w:color w:val="374151"/>
-                <w:sz w:val="20"/>
-                <w:szCs w:val="20"/>
-              </w:rPr>
-              <w:t xml:space="preserve">—</w:t>
-            </w:r>
-          </w:p>
-        </w:tc>
-        <w:tc>
-          <w:tcPr>
-            <w:tcW w:type="dxa" w:w="1200"/>
-            <w:tcBorders>
-              <w:top w:val="single" w:color="CCCCCC" w:sz="1"/>
-              <w:left w:val="single" w:color="CCCCCC" w:sz="1"/>
-              <w:bottom w:val="single" w:color="CCCCCC" w:sz="1"/>
-              <w:right w:val="single" w:color="CCCCCC" w:sz="1"/>
-            </w:tcBorders>
-            <w:shd w:fill="FAFAFA" w:val="clear"/>
-            <w:tcMar>
-              <w:top w:type="dxa" w:w="100"/>
-              <w:left w:type="dxa" w:w="140"/>
-              <w:bottom w:type="dxa" w:w="100"/>
-              <w:right w:type="dxa" w:w="140"/>
-            </w:tcMar>
-          </w:tcPr>
-          <w:p>
-            <w:r>
-              <w:rPr>
-                <w:b w:val="false"/>
-                <w:bCs w:val="false"/>
-                <w:color w:val="374151"/>
-                <w:sz w:val="20"/>
-                <w:szCs w:val="20"/>
-              </w:rPr>
-              <w:t xml:space="preserve">✅</w:t>
+              <w:t>CI validates typecheck, lint, unit tests, API E2E, Playwright, and Lighthouse</w:t>
+            </w:r>
+          </w:p>
+        </w:tc>
+        <w:tc>
+          <w:tcPr>
+            <w:tcW w:type="dxa" w:w="1200"/>
+            <w:tcBorders>
+              <w:top w:val="single" w:color="CCCCCC" w:sz="1"/>
+              <w:left w:val="single" w:color="CCCCCC" w:sz="1"/>
+              <w:bottom w:val="single" w:color="CCCCCC" w:sz="1"/>
+              <w:right w:val="single" w:color="CCCCCC" w:sz="1"/>
+            </w:tcBorders>
+            <w:shd w:fill="FAFAFA" w:val="clear"/>
+            <w:tcMar>
+              <w:top w:type="dxa" w:w="100"/>
+              <w:left w:type="dxa" w:w="140"/>
+              <w:bottom w:type="dxa" w:w="100"/>
+              <w:right w:type="dxa" w:w="140"/>
+            </w:tcMar>
+          </w:tcPr>
+          <w:p>
+            <w:r>
+              <w:t>✅</w:t>
+            </w:r>
+          </w:p>
+        </w:tc>
+        <w:tc>
+          <w:tcPr>
+            <w:tcW w:type="dxa" w:w="1200"/>
+            <w:tcBorders>
+              <w:top w:val="single" w:color="CCCCCC" w:sz="1"/>
+              <w:left w:val="single" w:color="CCCCCC" w:sz="1"/>
+              <w:bottom w:val="single" w:color="CCCCCC" w:sz="1"/>
+              <w:right w:val="single" w:color="CCCCCC" w:sz="1"/>
+            </w:tcBorders>
+            <w:shd w:fill="FAFAFA" w:val="clear"/>
+            <w:tcMar>
+              <w:top w:type="dxa" w:w="100"/>
+              <w:left w:type="dxa" w:w="140"/>
+              <w:bottom w:type="dxa" w:w="100"/>
+              <w:right w:type="dxa" w:w="140"/>
+            </w:tcMar>
+          </w:tcPr>
+          <w:p>
+            <w:r>
+              <w:t>✅</w:t>
             </w:r>
           </w:p>
         </w:tc>
@@ -6123,74 +5983,53 @@
           </w:tcPr>
           <w:p>
             <w:r>
-              <w:rPr>
-                <w:b w:val="false"/>
-                <w:bCs w:val="false"/>
-                <w:color w:val="374151"/>
-                <w:sz w:val="20"/>
-                <w:szCs w:val="20"/>
-              </w:rPr>
-              <w:t xml:space="preserve">NestJS E2E tests pass with &gt; 80% route coverage</w:t>
-            </w:r>
-          </w:p>
-        </w:tc>
-        <w:tc>
-          <w:tcPr>
-            <w:tcW w:type="dxa" w:w="1200"/>
-            <w:tcBorders>
-              <w:top w:val="single" w:color="CCCCCC" w:sz="1"/>
-              <w:left w:val="single" w:color="CCCCCC" w:sz="1"/>
-              <w:bottom w:val="single" w:color="CCCCCC" w:sz="1"/>
-              <w:right w:val="single" w:color="CCCCCC" w:sz="1"/>
-            </w:tcBorders>
-            <w:shd w:fill="FAFAFA" w:val="clear"/>
-            <w:tcMar>
-              <w:top w:type="dxa" w:w="100"/>
-              <w:left w:type="dxa" w:w="140"/>
-              <w:bottom w:type="dxa" w:w="100"/>
-              <w:right w:type="dxa" w:w="140"/>
-            </w:tcMar>
-          </w:tcPr>
-          <w:p>
-            <w:r>
-              <w:rPr>
-                <w:b w:val="false"/>
-                <w:bCs w:val="false"/>
-                <w:color w:val="374151"/>
-                <w:sz w:val="20"/>
-                <w:szCs w:val="20"/>
-              </w:rPr>
-              <w:t xml:space="preserve">✅</w:t>
-            </w:r>
-          </w:p>
-        </w:tc>
-        <w:tc>
-          <w:tcPr>
-            <w:tcW w:type="dxa" w:w="1200"/>
-            <w:tcBorders>
-              <w:top w:val="single" w:color="CCCCCC" w:sz="1"/>
-              <w:left w:val="single" w:color="CCCCCC" w:sz="1"/>
-              <w:bottom w:val="single" w:color="CCCCCC" w:sz="1"/>
-              <w:right w:val="single" w:color="CCCCCC" w:sz="1"/>
-            </w:tcBorders>
-            <w:shd w:fill="FAFAFA" w:val="clear"/>
-            <w:tcMar>
-              <w:top w:type="dxa" w:w="100"/>
-              <w:left w:type="dxa" w:w="140"/>
-              <w:bottom w:type="dxa" w:w="100"/>
-              <w:right w:type="dxa" w:w="140"/>
-            </w:tcMar>
-          </w:tcPr>
-          <w:p>
-            <w:r>
-              <w:rPr>
-                <w:b w:val="false"/>
-                <w:bCs w:val="false"/>
-                <w:color w:val="374151"/>
-                <w:sz w:val="20"/>
-                <w:szCs w:val="20"/>
-              </w:rPr>
-              <w:t xml:space="preserve">—</w:t>
+              <w:t>NestJS E2E tests cover critical API flows</w:t>
+            </w:r>
+          </w:p>
+        </w:tc>
+        <w:tc>
+          <w:tcPr>
+            <w:tcW w:type="dxa" w:w="1200"/>
+            <w:tcBorders>
+              <w:top w:val="single" w:color="CCCCCC" w:sz="1"/>
+              <w:left w:val="single" w:color="CCCCCC" w:sz="1"/>
+              <w:bottom w:val="single" w:color="CCCCCC" w:sz="1"/>
+              <w:right w:val="single" w:color="CCCCCC" w:sz="1"/>
+            </w:tcBorders>
+            <w:shd w:fill="FAFAFA" w:val="clear"/>
+            <w:tcMar>
+              <w:top w:type="dxa" w:w="100"/>
+              <w:left w:type="dxa" w:w="140"/>
+              <w:bottom w:type="dxa" w:w="100"/>
+              <w:right w:type="dxa" w:w="140"/>
+            </w:tcMar>
+          </w:tcPr>
+          <w:p>
+            <w:r>
+              <w:t>✅</w:t>
+            </w:r>
+          </w:p>
+        </w:tc>
+        <w:tc>
+          <w:tcPr>
+            <w:tcW w:type="dxa" w:w="1200"/>
+            <w:tcBorders>
+              <w:top w:val="single" w:color="CCCCCC" w:sz="1"/>
+              <w:left w:val="single" w:color="CCCCCC" w:sz="1"/>
+              <w:bottom w:val="single" w:color="CCCCCC" w:sz="1"/>
+              <w:right w:val="single" w:color="CCCCCC" w:sz="1"/>
+            </w:tcBorders>
+            <w:shd w:fill="FAFAFA" w:val="clear"/>
+            <w:tcMar>
+              <w:top w:type="dxa" w:w="100"/>
+              <w:left w:type="dxa" w:w="140"/>
+              <w:bottom w:type="dxa" w:w="100"/>
+              <w:right w:type="dxa" w:w="140"/>
+            </w:tcMar>
+          </w:tcPr>
+          <w:p>
+            <w:r>
+              <w:t>—</w:t>
             </w:r>
           </w:p>
         </w:tc>
@@ -6218,74 +6057,53 @@
           </w:tcPr>
           <w:p>
             <w:r>
-              <w:rPr>
-                <w:b w:val="false"/>
-                <w:bCs w:val="false"/>
-                <w:color w:val="374151"/>
-                <w:sz w:val="20"/>
-                <w:szCs w:val="20"/>
-              </w:rPr>
-              <w:t xml:space="preserve">Lighthouse Performance ≥ 80 on game page (desktop)</w:t>
-            </w:r>
-          </w:p>
-        </w:tc>
-        <w:tc>
-          <w:tcPr>
-            <w:tcW w:type="dxa" w:w="1200"/>
-            <w:tcBorders>
-              <w:top w:val="single" w:color="CCCCCC" w:sz="1"/>
-              <w:left w:val="single" w:color="CCCCCC" w:sz="1"/>
-              <w:bottom w:val="single" w:color="CCCCCC" w:sz="1"/>
-              <w:right w:val="single" w:color="CCCCCC" w:sz="1"/>
-            </w:tcBorders>
-            <w:shd w:fill="FAFAFA" w:val="clear"/>
-            <w:tcMar>
-              <w:top w:type="dxa" w:w="100"/>
-              <w:left w:type="dxa" w:w="140"/>
-              <w:bottom w:type="dxa" w:w="100"/>
-              <w:right w:type="dxa" w:w="140"/>
-            </w:tcMar>
-          </w:tcPr>
-          <w:p>
-            <w:r>
-              <w:rPr>
-                <w:b w:val="false"/>
-                <w:bCs w:val="false"/>
-                <w:color w:val="374151"/>
-                <w:sz w:val="20"/>
-                <w:szCs w:val="20"/>
-              </w:rPr>
-              <w:t xml:space="preserve">—</w:t>
-            </w:r>
-          </w:p>
-        </w:tc>
-        <w:tc>
-          <w:tcPr>
-            <w:tcW w:type="dxa" w:w="1200"/>
-            <w:tcBorders>
-              <w:top w:val="single" w:color="CCCCCC" w:sz="1"/>
-              <w:left w:val="single" w:color="CCCCCC" w:sz="1"/>
-              <w:bottom w:val="single" w:color="CCCCCC" w:sz="1"/>
-              <w:right w:val="single" w:color="CCCCCC" w:sz="1"/>
-            </w:tcBorders>
-            <w:shd w:fill="FAFAFA" w:val="clear"/>
-            <w:tcMar>
-              <w:top w:type="dxa" w:w="100"/>
-              <w:left w:type="dxa" w:w="140"/>
-              <w:bottom w:type="dxa" w:w="100"/>
-              <w:right w:type="dxa" w:w="140"/>
-            </w:tcMar>
-          </w:tcPr>
-          <w:p>
-            <w:r>
-              <w:rPr>
-                <w:b w:val="false"/>
-                <w:bCs w:val="false"/>
-                <w:color w:val="374151"/>
-                <w:sz w:val="20"/>
-                <w:szCs w:val="20"/>
-              </w:rPr>
-              <w:t xml:space="preserve">✅</w:t>
+              <w:t>Lighthouse Performance ≥ 80 and Accessibility ≥ 85 on desktop game page</w:t>
+            </w:r>
+          </w:p>
+        </w:tc>
+        <w:tc>
+          <w:tcPr>
+            <w:tcW w:type="dxa" w:w="1200"/>
+            <w:tcBorders>
+              <w:top w:val="single" w:color="CCCCCC" w:sz="1"/>
+              <w:left w:val="single" w:color="CCCCCC" w:sz="1"/>
+              <w:bottom w:val="single" w:color="CCCCCC" w:sz="1"/>
+              <w:right w:val="single" w:color="CCCCCC" w:sz="1"/>
+            </w:tcBorders>
+            <w:shd w:fill="FAFAFA" w:val="clear"/>
+            <w:tcMar>
+              <w:top w:type="dxa" w:w="100"/>
+              <w:left w:type="dxa" w:w="140"/>
+              <w:bottom w:type="dxa" w:w="100"/>
+              <w:right w:type="dxa" w:w="140"/>
+            </w:tcMar>
+          </w:tcPr>
+          <w:p>
+            <w:r>
+              <w:t>—</w:t>
+            </w:r>
+          </w:p>
+        </w:tc>
+        <w:tc>
+          <w:tcPr>
+            <w:tcW w:type="dxa" w:w="1200"/>
+            <w:tcBorders>
+              <w:top w:val="single" w:color="CCCCCC" w:sz="1"/>
+              <w:left w:val="single" w:color="CCCCCC" w:sz="1"/>
+              <w:bottom w:val="single" w:color="CCCCCC" w:sz="1"/>
+              <w:right w:val="single" w:color="CCCCCC" w:sz="1"/>
+            </w:tcBorders>
+            <w:shd w:fill="FAFAFA" w:val="clear"/>
+            <w:tcMar>
+              <w:top w:type="dxa" w:w="100"/>
+              <w:left w:type="dxa" w:w="140"/>
+              <w:bottom w:type="dxa" w:w="100"/>
+              <w:right w:type="dxa" w:w="140"/>
+            </w:tcMar>
+          </w:tcPr>
+          <w:p>
+            <w:r>
+              <w:t>✅</w:t>
             </w:r>
           </w:p>
         </w:tc>
@@ -6313,74 +6131,53 @@
           </w:tcPr>
           <w:p>
             <w:r>
-              <w:rPr>
-                <w:b w:val="false"/>
-                <w:bCs w:val="false"/>
-                <w:color w:val="374151"/>
-                <w:sz w:val="20"/>
-                <w:szCs w:val="20"/>
-              </w:rPr>
-              <w:t xml:space="preserve">CloudWatch alarms configured and sending to SNS</w:t>
-            </w:r>
-          </w:p>
-        </w:tc>
-        <w:tc>
-          <w:tcPr>
-            <w:tcW w:type="dxa" w:w="1200"/>
-            <w:tcBorders>
-              <w:top w:val="single" w:color="CCCCCC" w:sz="1"/>
-              <w:left w:val="single" w:color="CCCCCC" w:sz="1"/>
-              <w:bottom w:val="single" w:color="CCCCCC" w:sz="1"/>
-              <w:right w:val="single" w:color="CCCCCC" w:sz="1"/>
-            </w:tcBorders>
-            <w:shd w:fill="FAFAFA" w:val="clear"/>
-            <w:tcMar>
-              <w:top w:type="dxa" w:w="100"/>
-              <w:left w:type="dxa" w:w="140"/>
-              <w:bottom w:type="dxa" w:w="100"/>
-              <w:right w:type="dxa" w:w="140"/>
-            </w:tcMar>
-          </w:tcPr>
-          <w:p>
-            <w:r>
-              <w:rPr>
-                <w:b w:val="false"/>
-                <w:bCs w:val="false"/>
-                <w:color w:val="374151"/>
-                <w:sz w:val="20"/>
-                <w:szCs w:val="20"/>
-              </w:rPr>
-              <w:t xml:space="preserve">✅</w:t>
-            </w:r>
-          </w:p>
-        </w:tc>
-        <w:tc>
-          <w:tcPr>
-            <w:tcW w:type="dxa" w:w="1200"/>
-            <w:tcBorders>
-              <w:top w:val="single" w:color="CCCCCC" w:sz="1"/>
-              <w:left w:val="single" w:color="CCCCCC" w:sz="1"/>
-              <w:bottom w:val="single" w:color="CCCCCC" w:sz="1"/>
-              <w:right w:val="single" w:color="CCCCCC" w:sz="1"/>
-            </w:tcBorders>
-            <w:shd w:fill="FAFAFA" w:val="clear"/>
-            <w:tcMar>
-              <w:top w:type="dxa" w:w="100"/>
-              <w:left w:type="dxa" w:w="140"/>
-              <w:bottom w:type="dxa" w:w="100"/>
-              <w:right w:type="dxa" w:w="140"/>
-            </w:tcMar>
-          </w:tcPr>
-          <w:p>
-            <w:r>
-              <w:rPr>
-                <w:b w:val="false"/>
-                <w:bCs w:val="false"/>
-                <w:color w:val="374151"/>
-                <w:sz w:val="20"/>
-                <w:szCs w:val="20"/>
-              </w:rPr>
-              <w:t xml:space="preserve">—</w:t>
+              <w:t>Railway health checks report real PostgreSQL and Redis connectivity</w:t>
+            </w:r>
+          </w:p>
+        </w:tc>
+        <w:tc>
+          <w:tcPr>
+            <w:tcW w:type="dxa" w:w="1200"/>
+            <w:tcBorders>
+              <w:top w:val="single" w:color="CCCCCC" w:sz="1"/>
+              <w:left w:val="single" w:color="CCCCCC" w:sz="1"/>
+              <w:bottom w:val="single" w:color="CCCCCC" w:sz="1"/>
+              <w:right w:val="single" w:color="CCCCCC" w:sz="1"/>
+            </w:tcBorders>
+            <w:shd w:fill="FAFAFA" w:val="clear"/>
+            <w:tcMar>
+              <w:top w:type="dxa" w:w="100"/>
+              <w:left w:type="dxa" w:w="140"/>
+              <w:bottom w:type="dxa" w:w="100"/>
+              <w:right w:type="dxa" w:w="140"/>
+            </w:tcMar>
+          </w:tcPr>
+          <w:p>
+            <w:r>
+              <w:t>✅</w:t>
+            </w:r>
+          </w:p>
+        </w:tc>
+        <w:tc>
+          <w:tcPr>
+            <w:tcW w:type="dxa" w:w="1200"/>
+            <w:tcBorders>
+              <w:top w:val="single" w:color="CCCCCC" w:sz="1"/>
+              <w:left w:val="single" w:color="CCCCCC" w:sz="1"/>
+              <w:bottom w:val="single" w:color="CCCCCC" w:sz="1"/>
+              <w:right w:val="single" w:color="CCCCCC" w:sz="1"/>
+            </w:tcBorders>
+            <w:shd w:fill="FAFAFA" w:val="clear"/>
+            <w:tcMar>
+              <w:top w:type="dxa" w:w="100"/>
+              <w:left w:type="dxa" w:w="140"/>
+              <w:bottom w:type="dxa" w:w="100"/>
+              <w:right w:type="dxa" w:w="140"/>
+            </w:tcMar>
+          </w:tcPr>
+          <w:p>
+            <w:r>
+              <w:t>—</w:t>
             </w:r>
           </w:p>
         </w:tc>
@@ -6408,74 +6205,53 @@
           </w:tcPr>
           <w:p>
             <w:r>
-              <w:rPr>
-                <w:b w:val="false"/>
-                <w:bCs w:val="false"/>
-                <w:color w:val="374151"/>
-                <w:sz w:val="20"/>
-                <w:szCs w:val="20"/>
-              </w:rPr>
-              <w:t xml:space="preserve">Error tracking visible in Sentry dashboard</w:t>
-            </w:r>
-          </w:p>
-        </w:tc>
-        <w:tc>
-          <w:tcPr>
-            <w:tcW w:type="dxa" w:w="1200"/>
-            <w:tcBorders>
-              <w:top w:val="single" w:color="CCCCCC" w:sz="1"/>
-              <w:left w:val="single" w:color="CCCCCC" w:sz="1"/>
-              <w:bottom w:val="single" w:color="CCCCCC" w:sz="1"/>
-              <w:right w:val="single" w:color="CCCCCC" w:sz="1"/>
-            </w:tcBorders>
-            <w:shd w:fill="FAFAFA" w:val="clear"/>
-            <w:tcMar>
-              <w:top w:type="dxa" w:w="100"/>
-              <w:left w:type="dxa" w:w="140"/>
-              <w:bottom w:type="dxa" w:w="100"/>
-              <w:right w:type="dxa" w:w="140"/>
-            </w:tcMar>
-          </w:tcPr>
-          <w:p>
-            <w:r>
-              <w:rPr>
-                <w:b w:val="false"/>
-                <w:bCs w:val="false"/>
-                <w:color w:val="374151"/>
-                <w:sz w:val="20"/>
-                <w:szCs w:val="20"/>
-              </w:rPr>
-              <w:t xml:space="preserve">—</w:t>
-            </w:r>
-          </w:p>
-        </w:tc>
-        <w:tc>
-          <w:tcPr>
-            <w:tcW w:type="dxa" w:w="1200"/>
-            <w:tcBorders>
-              <w:top w:val="single" w:color="CCCCCC" w:sz="1"/>
-              <w:left w:val="single" w:color="CCCCCC" w:sz="1"/>
-              <w:bottom w:val="single" w:color="CCCCCC" w:sz="1"/>
-              <w:right w:val="single" w:color="CCCCCC" w:sz="1"/>
-            </w:tcBorders>
-            <w:shd w:fill="FAFAFA" w:val="clear"/>
-            <w:tcMar>
-              <w:top w:type="dxa" w:w="100"/>
-              <w:left w:type="dxa" w:w="140"/>
-              <w:bottom w:type="dxa" w:w="100"/>
-              <w:right w:type="dxa" w:w="140"/>
-            </w:tcMar>
-          </w:tcPr>
-          <w:p>
-            <w:r>
-              <w:rPr>
-                <w:b w:val="false"/>
-                <w:bCs w:val="false"/>
-                <w:color w:val="374151"/>
-                <w:sz w:val="20"/>
-                <w:szCs w:val="20"/>
-              </w:rPr>
-              <w:t xml:space="preserve">✅</w:t>
+              <w:t>Error tracking visible in Sentry dashboard with environment and release tags</w:t>
+            </w:r>
+          </w:p>
+        </w:tc>
+        <w:tc>
+          <w:tcPr>
+            <w:tcW w:type="dxa" w:w="1200"/>
+            <w:tcBorders>
+              <w:top w:val="single" w:color="CCCCCC" w:sz="1"/>
+              <w:left w:val="single" w:color="CCCCCC" w:sz="1"/>
+              <w:bottom w:val="single" w:color="CCCCCC" w:sz="1"/>
+              <w:right w:val="single" w:color="CCCCCC" w:sz="1"/>
+            </w:tcBorders>
+            <w:shd w:fill="FAFAFA" w:val="clear"/>
+            <w:tcMar>
+              <w:top w:type="dxa" w:w="100"/>
+              <w:left w:type="dxa" w:w="140"/>
+              <w:bottom w:type="dxa" w:w="100"/>
+              <w:right w:type="dxa" w:w="140"/>
+            </w:tcMar>
+          </w:tcPr>
+          <w:p>
+            <w:r>
+              <w:t>✅</w:t>
+            </w:r>
+          </w:p>
+        </w:tc>
+        <w:tc>
+          <w:tcPr>
+            <w:tcW w:type="dxa" w:w="1200"/>
+            <w:tcBorders>
+              <w:top w:val="single" w:color="CCCCCC" w:sz="1"/>
+              <w:left w:val="single" w:color="CCCCCC" w:sz="1"/>
+              <w:bottom w:val="single" w:color="CCCCCC" w:sz="1"/>
+              <w:right w:val="single" w:color="CCCCCC" w:sz="1"/>
+            </w:tcBorders>
+            <w:shd w:fill="FAFAFA" w:val="clear"/>
+            <w:tcMar>
+              <w:top w:type="dxa" w:w="100"/>
+              <w:left w:type="dxa" w:w="140"/>
+              <w:bottom w:type="dxa" w:w="100"/>
+              <w:right w:type="dxa" w:w="140"/>
+            </w:tcMar>
+          </w:tcPr>
+          <w:p>
+            <w:r>
+              <w:t>✅</w:t>
             </w:r>
           </w:p>
         </w:tc>
@@ -6503,74 +6279,53 @@
           </w:tcPr>
           <w:p>
             <w:r>
-              <w:rPr>
-                <w:b w:val="false"/>
-                <w:bCs w:val="false"/>
-                <w:color w:val="374151"/>
-                <w:sz w:val="20"/>
-                <w:szCs w:val="20"/>
-              </w:rPr>
-              <w:t xml:space="preserve">Zero critical security vulnerabilities in npm audit</w:t>
-            </w:r>
-          </w:p>
-        </w:tc>
-        <w:tc>
-          <w:tcPr>
-            <w:tcW w:type="dxa" w:w="1200"/>
-            <w:tcBorders>
-              <w:top w:val="single" w:color="CCCCCC" w:sz="1"/>
-              <w:left w:val="single" w:color="CCCCCC" w:sz="1"/>
-              <w:bottom w:val="single" w:color="CCCCCC" w:sz="1"/>
-              <w:right w:val="single" w:color="CCCCCC" w:sz="1"/>
-            </w:tcBorders>
-            <w:shd w:fill="FAFAFA" w:val="clear"/>
-            <w:tcMar>
-              <w:top w:type="dxa" w:w="100"/>
-              <w:left w:type="dxa" w:w="140"/>
-              <w:bottom w:type="dxa" w:w="100"/>
-              <w:right w:type="dxa" w:w="140"/>
-            </w:tcMar>
-          </w:tcPr>
-          <w:p>
-            <w:r>
-              <w:rPr>
-                <w:b w:val="false"/>
-                <w:bCs w:val="false"/>
-                <w:color w:val="374151"/>
-                <w:sz w:val="20"/>
-                <w:szCs w:val="20"/>
-              </w:rPr>
-              <w:t xml:space="preserve">✅</w:t>
-            </w:r>
-          </w:p>
-        </w:tc>
-        <w:tc>
-          <w:tcPr>
-            <w:tcW w:type="dxa" w:w="1200"/>
-            <w:tcBorders>
-              <w:top w:val="single" w:color="CCCCCC" w:sz="1"/>
-              <w:left w:val="single" w:color="CCCCCC" w:sz="1"/>
-              <w:bottom w:val="single" w:color="CCCCCC" w:sz="1"/>
-              <w:right w:val="single" w:color="CCCCCC" w:sz="1"/>
-            </w:tcBorders>
-            <w:shd w:fill="FAFAFA" w:val="clear"/>
-            <w:tcMar>
-              <w:top w:type="dxa" w:w="100"/>
-              <w:left w:type="dxa" w:w="140"/>
-              <w:bottom w:type="dxa" w:w="100"/>
-              <w:right w:type="dxa" w:w="140"/>
-            </w:tcMar>
-          </w:tcPr>
-          <w:p>
-            <w:r>
-              <w:rPr>
-                <w:b w:val="false"/>
-                <w:bCs w:val="false"/>
-                <w:color w:val="374151"/>
-                <w:sz w:val="20"/>
-                <w:szCs w:val="20"/>
-              </w:rPr>
-              <w:t xml:space="preserve">✅</w:t>
+              <w:t>Zero critical security vulnerabilities in npm audit</w:t>
+            </w:r>
+          </w:p>
+        </w:tc>
+        <w:tc>
+          <w:tcPr>
+            <w:tcW w:type="dxa" w:w="1200"/>
+            <w:tcBorders>
+              <w:top w:val="single" w:color="CCCCCC" w:sz="1"/>
+              <w:left w:val="single" w:color="CCCCCC" w:sz="1"/>
+              <w:bottom w:val="single" w:color="CCCCCC" w:sz="1"/>
+              <w:right w:val="single" w:color="CCCCCC" w:sz="1"/>
+            </w:tcBorders>
+            <w:shd w:fill="FAFAFA" w:val="clear"/>
+            <w:tcMar>
+              <w:top w:type="dxa" w:w="100"/>
+              <w:left w:type="dxa" w:w="140"/>
+              <w:bottom w:type="dxa" w:w="100"/>
+              <w:right w:type="dxa" w:w="140"/>
+            </w:tcMar>
+          </w:tcPr>
+          <w:p>
+            <w:r>
+              <w:t>✅</w:t>
+            </w:r>
+          </w:p>
+        </w:tc>
+        <w:tc>
+          <w:tcPr>
+            <w:tcW w:type="dxa" w:w="1200"/>
+            <w:tcBorders>
+              <w:top w:val="single" w:color="CCCCCC" w:sz="1"/>
+              <w:left w:val="single" w:color="CCCCCC" w:sz="1"/>
+              <w:bottom w:val="single" w:color="CCCCCC" w:sz="1"/>
+              <w:right w:val="single" w:color="CCCCCC" w:sz="1"/>
+            </w:tcBorders>
+            <w:shd w:fill="FAFAFA" w:val="clear"/>
+            <w:tcMar>
+              <w:top w:type="dxa" w:w="100"/>
+              <w:left w:type="dxa" w:w="140"/>
+              <w:bottom w:type="dxa" w:w="100"/>
+              <w:right w:type="dxa" w:w="140"/>
+            </w:tcMar>
+          </w:tcPr>
+          <w:p>
+            <w:r>
+              <w:t>✅</w:t>
             </w:r>
           </w:p>
         </w:tc>
@@ -6584,6 +6339,570 @@
         <w:spacing w:after="200" w:before="200"/>
       </w:pPr>
     </w:p>
+    <w:p/>
+    <w:p>
+      <w:r>
+        <w:t xml:space="preserve">  Sprint 6: Admin Studio &amp; Governance</w:t>
+      </w:r>
+    </w:p>
+    <w:p>
+      <w:r>
+        <w:t xml:space="preserve">  ⏱ 2 weeks   🎯 Goal: Complete admin dashboard, RBAC, visual problem builder, publishing controls, and soft delete</w:t>
+      </w:r>
+    </w:p>
+    <w:p>
+      <w:pPr>
+        <w:pStyle w:val="Heading2"/>
+      </w:pPr>
+      <w:r>
+        <w:t>Backend Tasks</w:t>
+      </w:r>
+    </w:p>
+    <w:p>
+      <w:pPr>
+        <w:pStyle w:val="ListParagraph"/>
+      </w:pPr>
+      <w:r>
+        <w:t>•</w:t>
+        <w:tab/>
+        <w:t>Add RBAC with roles, permissions, guards, and shared auth payload updates</w:t>
+      </w:r>
+    </w:p>
+    <w:p>
+      <w:pPr>
+        <w:pStyle w:val="ListParagraph"/>
+      </w:pPr>
+      <w:r>
+        <w:t>•</w:t>
+        <w:tab/>
+        <w:t>Seed an env-driven admin account using ADMIN_EMAIL, ADMIN_PASSWORD, ADMIN_USERNAME, and ADMIN_DISPLAY_NAME</w:t>
+      </w:r>
+    </w:p>
+    <w:p>
+      <w:pPr>
+        <w:pStyle w:val="ListParagraph"/>
+      </w:pPr>
+      <w:r>
+        <w:t>•</w:t>
+        <w:tab/>
+        <w:t>Add admin statistics APIs for content, users, submissions, pass rate, problem quality, and recent activity</w:t>
+      </w:r>
+    </w:p>
+    <w:p>
+      <w:pPr>
+        <w:pStyle w:val="ListParagraph"/>
+      </w:pPr>
+      <w:r>
+        <w:t>•</w:t>
+        <w:tab/>
+        <w:t>Extend admin problem APIs to create/edit problems, create/edit/reorder requirements, save nodes/edges/answer keys, publish/hide, soft delete, and restore</w:t>
+      </w:r>
+    </w:p>
+    <w:p>
+      <w:pPr>
+        <w:pStyle w:val="ListParagraph"/>
+      </w:pPr>
+      <w:r>
+        <w:t>•</w:t>
+        <w:tab/>
+        <w:t>Add soft delete via deletedAt; public problem APIs exclude deleted problems, admin APIs can filter active, hidden, and deleted records</w:t>
+      </w:r>
+    </w:p>
+    <w:p>
+      <w:pPr>
+        <w:pStyle w:val="ListParagraph"/>
+      </w:pPr>
+      <w:r>
+        <w:t>•</w:t>
+        <w:tab/>
+        <w:t>Add validation that every requirement graph has valid node IDs, valid edge endpoints, and answer keys matching blankable component nodes</w:t>
+      </w:r>
+    </w:p>
+    <w:p/>
+    <w:p>
+      <w:pPr>
+        <w:pStyle w:val="Heading2"/>
+      </w:pPr>
+      <w:r>
+        <w:t>Frontend Tasks</w:t>
+      </w:r>
+    </w:p>
+    <w:p>
+      <w:pPr>
+        <w:pStyle w:val="ListParagraph"/>
+      </w:pPr>
+      <w:r>
+        <w:t>•</w:t>
+        <w:tab/>
+        <w:t>Add /admin dashboard with KPI cards, charts, recent activity, and a problem quality table</w:t>
+      </w:r>
+    </w:p>
+    <w:p>
+      <w:pPr>
+        <w:pStyle w:val="ListParagraph"/>
+      </w:pPr>
+      <w:r>
+        <w:t>•</w:t>
+        <w:tab/>
+        <w:t>Add /admin/problems list with status filters, search, publish/hide, soft delete, restore, and row actions</w:t>
+      </w:r>
+    </w:p>
+    <w:p>
+      <w:pPr>
+        <w:pStyle w:val="ListParagraph"/>
+      </w:pPr>
+      <w:r>
+        <w:t>•</w:t>
+        <w:tab/>
+        <w:t>Add /admin/problems/new and /admin/problems/[slug]/edit with a React Flow visual builder per requirement</w:t>
+      </w:r>
+    </w:p>
+    <w:p>
+      <w:pPr>
+        <w:pStyle w:val="ListParagraph"/>
+      </w:pPr>
+      <w:r>
+        <w:t>•</w:t>
+        <w:tab/>
+        <w:t>Builder supports problem metadata, requirement editor, node placement, edge drawing, answer marking, validation, and player-preview mode</w:t>
+      </w:r>
+    </w:p>
+    <w:p>
+      <w:pPr>
+        <w:pStyle w:val="ListParagraph"/>
+      </w:pPr>
+      <w:r>
+        <w:t>•</w:t>
+        <w:tab/>
+        <w:t>Admin UI uses a data-dense operational layout, existing design tokens, light/dark support, keyboard focus states, loading states, and error states</w:t>
+      </w:r>
+    </w:p>
+    <w:p>
+      <w:pPr>
+        <w:pStyle w:val="ListParagraph"/>
+      </w:pPr>
+      <w:r>
+        <w:t>•</w:t>
+        <w:tab/>
+        <w:t>Hide admin navigation and block admin routes for non-admin users with a clear unauthorized state</w:t>
+      </w:r>
+    </w:p>
+    <w:p/>
+    <w:p>
+      <w:pPr>
+        <w:pStyle w:val="Heading2"/>
+      </w:pPr>
+      <w:r>
+        <w:t>Public Interfaces</w:t>
+      </w:r>
+    </w:p>
+    <w:p>
+      <w:pPr>
+        <w:pStyle w:val="ListParagraph"/>
+      </w:pPr>
+      <w:r>
+        <w:t>•</w:t>
+        <w:tab/>
+        <w:t>Document shared types: Role, Permission, AdminStatsResponse, AdminProblemDetail, AdminRequirementInput, and AdminProblemMutationRequest</w:t>
+      </w:r>
+    </w:p>
+    <w:p>
+      <w:pPr>
+        <w:pStyle w:val="ListParagraph"/>
+      </w:pPr>
+      <w:r>
+        <w:t>•</w:t>
+        <w:tab/>
+        <w:t>Add /api/v1/admin/stats for dashboard metrics</w:t>
+      </w:r>
+    </w:p>
+    <w:p>
+      <w:pPr>
+        <w:pStyle w:val="ListParagraph"/>
+      </w:pPr>
+      <w:r>
+        <w:t>•</w:t>
+        <w:tab/>
+        <w:t>Add /api/v1/admin/problems for list/create and /api/v1/admin/problems/:slug for read/update</w:t>
+      </w:r>
+    </w:p>
+    <w:p>
+      <w:pPr>
+        <w:pStyle w:val="ListParagraph"/>
+      </w:pPr>
+      <w:r>
+        <w:t>•</w:t>
+        <w:tab/>
+        <w:t>Add /api/v1/admin/problems/:slug/requirements for create/update/reorder requirement data</w:t>
+      </w:r>
+    </w:p>
+    <w:p>
+      <w:pPr>
+        <w:pStyle w:val="ListParagraph"/>
+      </w:pPr>
+      <w:r>
+        <w:t>•</w:t>
+        <w:tab/>
+        <w:t>Add publish, hide, delete, and restore endpoints for admin problem lifecycle management</w:t>
+      </w:r>
+    </w:p>
+    <w:p>
+      <w:pPr>
+        <w:pStyle w:val="ListParagraph"/>
+      </w:pPr>
+      <w:r>
+        <w:t>•</w:t>
+        <w:tab/>
+        <w:t>Default permissions: ADMIN has all admin permissions, CONTENT_EDITOR manages content without role management, USER has no admin access</w:t>
+      </w:r>
+    </w:p>
+    <w:p/>
+    <w:p/>
+    <w:p>
+      <w:pPr>
+        <w:pStyle w:val="Heading2"/>
+      </w:pPr>
+      <w:r>
+        <w:t>Sprint 6 Test Plan</w:t>
+      </w:r>
+    </w:p>
+    <w:p>
+      <w:r>
+        <w:t>•</w:t>
+        <w:tab/>
+        <w:t>Backend unit/E2E tests cover RBAC denial/allow, seeded admin login, admin stats, problem create/update, requirement graph save, publish/hide, soft delete, and restore</w:t>
+      </w:r>
+    </w:p>
+    <w:p>
+      <w:r>
+        <w:t>•</w:t>
+        <w:tab/>
+        <w:t>Frontend tests cover admin route protection, dashboard rendering, problem list actions, and builder validation</w:t>
+      </w:r>
+    </w:p>
+    <w:p>
+      <w:r>
+        <w:t>•</w:t>
+        <w:tab/>
+        <w:t>Playwright covers admin login → create draft problem → build requirement → publish → verify problem playable → hide → soft delete → restore</w:t>
+      </w:r>
+    </w:p>
+    <w:p>
+      <w:r>
+        <w:t>•</w:t>
+        <w:tab/>
+        <w:t>Run npm run typecheck, npm run lint, and npm run test before marking Sprint 6 complete</w:t>
+      </w:r>
+    </w:p>
+    <w:p/>
+    <w:p>
+      <w:pPr>
+        <w:pStyle w:val="Heading2"/>
+      </w:pPr>
+      <w:r>
+        <w:t>Sprint 6 Acceptance Criteria</w:t>
+      </w:r>
+    </w:p>
+    <w:tbl>
+      <w:tblPr>
+        <w:tblW w:type="auto" w:w="0"/>
+        <w:tblLook w:firstColumn="1" w:firstRow="1" w:lastColumn="0" w:lastRow="0" w:noHBand="0" w:noVBand="1" w:val="04A0"/>
+      </w:tblPr>
+      <w:tblGrid>
+        <w:gridCol w:w="3240"/>
+        <w:gridCol w:w="3240"/>
+        <w:gridCol w:w="3240"/>
+      </w:tblGrid>
+      <w:tr>
+        <w:tc>
+          <w:tcPr>
+            <w:tcW w:type="dxa" w:w="3240"/>
+          </w:tcPr>
+          <w:p>
+            <w:r>
+              <w:t>Criterion</w:t>
+            </w:r>
+          </w:p>
+        </w:tc>
+        <w:tc>
+          <w:tcPr>
+            <w:tcW w:type="dxa" w:w="3240"/>
+          </w:tcPr>
+          <w:p>
+            <w:r>
+              <w:t>Backend</w:t>
+            </w:r>
+          </w:p>
+        </w:tc>
+        <w:tc>
+          <w:tcPr>
+            <w:tcW w:type="dxa" w:w="3240"/>
+          </w:tcPr>
+          <w:p>
+            <w:r>
+              <w:t>Frontend</w:t>
+            </w:r>
+          </w:p>
+        </w:tc>
+      </w:tr>
+      <w:tr>
+        <w:tc>
+          <w:tcPr>
+            <w:tcW w:type="dxa" w:w="3240"/>
+          </w:tcPr>
+          <w:p>
+            <w:r>
+              <w:t>Seed script creates or updates one env-driven admin user and assigns ADMIN</w:t>
+            </w:r>
+          </w:p>
+        </w:tc>
+        <w:tc>
+          <w:tcPr>
+            <w:tcW w:type="dxa" w:w="3240"/>
+          </w:tcPr>
+          <w:p>
+            <w:r>
+              <w:t>✅</w:t>
+            </w:r>
+          </w:p>
+        </w:tc>
+        <w:tc>
+          <w:tcPr>
+            <w:tcW w:type="dxa" w:w="3240"/>
+          </w:tcPr>
+          <w:p>
+            <w:r>
+              <w:t>—</w:t>
+            </w:r>
+          </w:p>
+        </w:tc>
+      </w:tr>
+      <w:tr>
+        <w:tc>
+          <w:tcPr>
+            <w:tcW w:type="dxa" w:w="3240"/>
+          </w:tcPr>
+          <w:p>
+            <w:r>
+              <w:t>Non-admin users cannot access /admin UI or /api/v1/admin/*</w:t>
+            </w:r>
+          </w:p>
+        </w:tc>
+        <w:tc>
+          <w:tcPr>
+            <w:tcW w:type="dxa" w:w="3240"/>
+          </w:tcPr>
+          <w:p>
+            <w:r>
+              <w:t>✅</w:t>
+            </w:r>
+          </w:p>
+        </w:tc>
+        <w:tc>
+          <w:tcPr>
+            <w:tcW w:type="dxa" w:w="3240"/>
+          </w:tcPr>
+          <w:p>
+            <w:r>
+              <w:t>✅</w:t>
+            </w:r>
+          </w:p>
+        </w:tc>
+      </w:tr>
+      <w:tr>
+        <w:tc>
+          <w:tcPr>
+            <w:tcW w:type="dxa" w:w="3240"/>
+          </w:tcPr>
+          <w:p>
+            <w:r>
+              <w:t>Admin dashboard shows content, user, submission, pass-rate, and recent-activity statistics</w:t>
+            </w:r>
+          </w:p>
+        </w:tc>
+        <w:tc>
+          <w:tcPr>
+            <w:tcW w:type="dxa" w:w="3240"/>
+          </w:tcPr>
+          <w:p>
+            <w:r>
+              <w:t>✅</w:t>
+            </w:r>
+          </w:p>
+        </w:tc>
+        <w:tc>
+          <w:tcPr>
+            <w:tcW w:type="dxa" w:w="3240"/>
+          </w:tcPr>
+          <w:p>
+            <w:r>
+              <w:t>✅</w:t>
+            </w:r>
+          </w:p>
+        </w:tc>
+      </w:tr>
+      <w:tr>
+        <w:tc>
+          <w:tcPr>
+            <w:tcW w:type="dxa" w:w="3240"/>
+          </w:tcPr>
+          <w:p>
+            <w:r>
+              <w:t>Admin can create a problem with multiple requirements using a visual graph builder</w:t>
+            </w:r>
+          </w:p>
+        </w:tc>
+        <w:tc>
+          <w:tcPr>
+            <w:tcW w:type="dxa" w:w="3240"/>
+          </w:tcPr>
+          <w:p>
+            <w:r>
+              <w:t>✅</w:t>
+            </w:r>
+          </w:p>
+        </w:tc>
+        <w:tc>
+          <w:tcPr>
+            <w:tcW w:type="dxa" w:w="3240"/>
+          </w:tcPr>
+          <w:p>
+            <w:r>
+              <w:t>✅</w:t>
+            </w:r>
+          </w:p>
+        </w:tc>
+      </w:tr>
+      <w:tr>
+        <w:tc>
+          <w:tcPr>
+            <w:tcW w:type="dxa" w:w="3240"/>
+          </w:tcPr>
+          <w:p>
+            <w:r>
+              <w:t>Created problems are playable through the normal /problems/[slug] flow after publishing</w:t>
+            </w:r>
+          </w:p>
+        </w:tc>
+        <w:tc>
+          <w:tcPr>
+            <w:tcW w:type="dxa" w:w="3240"/>
+          </w:tcPr>
+          <w:p>
+            <w:r>
+              <w:t>✅</w:t>
+            </w:r>
+          </w:p>
+        </w:tc>
+        <w:tc>
+          <w:tcPr>
+            <w:tcW w:type="dxa" w:w="3240"/>
+          </w:tcPr>
+          <w:p>
+            <w:r>
+              <w:t>✅</w:t>
+            </w:r>
+          </w:p>
+        </w:tc>
+      </w:tr>
+      <w:tr>
+        <w:tc>
+          <w:tcPr>
+            <w:tcW w:type="dxa" w:w="3240"/>
+          </w:tcPr>
+          <w:p>
+            <w:r>
+              <w:t>Admin can hide a problem without deleting data</w:t>
+            </w:r>
+          </w:p>
+        </w:tc>
+        <w:tc>
+          <w:tcPr>
+            <w:tcW w:type="dxa" w:w="3240"/>
+          </w:tcPr>
+          <w:p>
+            <w:r>
+              <w:t>✅</w:t>
+            </w:r>
+          </w:p>
+        </w:tc>
+        <w:tc>
+          <w:tcPr>
+            <w:tcW w:type="dxa" w:w="3240"/>
+          </w:tcPr>
+          <w:p>
+            <w:r>
+              <w:t>✅</w:t>
+            </w:r>
+          </w:p>
+        </w:tc>
+      </w:tr>
+      <w:tr>
+        <w:tc>
+          <w:tcPr>
+            <w:tcW w:type="dxa" w:w="3240"/>
+          </w:tcPr>
+          <w:p>
+            <w:r>
+              <w:t>Admin can soft delete and restore a problem; public pages never show soft-deleted problems</w:t>
+            </w:r>
+          </w:p>
+        </w:tc>
+        <w:tc>
+          <w:tcPr>
+            <w:tcW w:type="dxa" w:w="3240"/>
+          </w:tcPr>
+          <w:p>
+            <w:r>
+              <w:t>✅</w:t>
+            </w:r>
+          </w:p>
+        </w:tc>
+        <w:tc>
+          <w:tcPr>
+            <w:tcW w:type="dxa" w:w="3240"/>
+          </w:tcPr>
+          <w:p>
+            <w:r>
+              <w:t>✅</w:t>
+            </w:r>
+          </w:p>
+        </w:tc>
+      </w:tr>
+      <w:tr>
+        <w:tc>
+          <w:tcPr>
+            <w:tcW w:type="dxa" w:w="3240"/>
+          </w:tcPr>
+          <w:p>
+            <w:r>
+              <w:t>All admin pages include light/dark, loading, empty, error, validation, and keyboard states</w:t>
+            </w:r>
+          </w:p>
+        </w:tc>
+        <w:tc>
+          <w:tcPr>
+            <w:tcW w:type="dxa" w:w="3240"/>
+          </w:tcPr>
+          <w:p>
+            <w:r>
+              <w:t>—</w:t>
+            </w:r>
+          </w:p>
+        </w:tc>
+        <w:tc>
+          <w:tcPr>
+            <w:tcW w:type="dxa" w:w="3240"/>
+          </w:tcPr>
+          <w:p>
+            <w:r>
+              <w:t>✅</w:t>
+            </w:r>
+          </w:p>
+        </w:tc>
+      </w:tr>
+    </w:tbl>
+    <w:p/>
     <w:p>
       <w:pPr>
         <w:pStyle w:val="Heading1"/>
@@ -6763,12 +7082,7 @@
         <w:ind w:left="240"/>
       </w:pPr>
       <w:r>
-        <w:rPr>
-          <w:color w:val="065F46"/>
-          <w:sz w:val="20"/>
-          <w:szCs w:val="20"/>
-        </w:rPr>
-        <w:t xml:space="preserve">🚨  AI Agent Critical: Never store secrets in code. All environment variables must be in .env.local (gitignored) for development. For production, all secrets are in AWS Secrets Manager and injected by ECS task definitions. See the Deployment Plan document for the complete env var list.</w:t>
+        <w:t>🚨  AI Agent Critical: Never store secrets in code. All environment variables must be in .env.local (gitignored) for development. For production on Railway, set secrets in Railway Dashboard → Service Variables; Railway injects DATABASE_URL and REDIS_URL from managed plugins. See the Deployment Plan document for the complete env var list.</w:t>
       </w:r>
     </w:p>
     <w:p>

</xml_diff>